<commit_message>
EHIS-3804 [ Temp Food Premise permit Template]
</commit_message>
<xml_diff>
--- a/PHOCS-Docgentemplates/PHOCS Food Premise Operating Permit Template_v5.docx
+++ b/PHOCS-Docgentemplates/PHOCS Food Premise Operating Permit Template_v5.docx
@@ -4,7 +4,7 @@
   <w:body>
     <w:tbl>
       <w:tblPr>
-        <w:tblW w:w="8672" w:type="dxa"/>
+        <w:tblW w:w="9493" w:type="dxa"/>
         <w:tblLayout w:type="fixed"/>
         <w:tblCellMar>
           <w:left w:w="0" w:type="dxa"/>
@@ -14,7 +14,7 @@
       </w:tblPr>
       <w:tblGrid>
         <w:gridCol w:w="4820"/>
-        <w:gridCol w:w="3852"/>
+        <w:gridCol w:w="4673"/>
       </w:tblGrid>
       <w:tr>
         <w:trPr>
@@ -71,7 +71,7 @@
         </w:tc>
         <w:tc>
           <w:tcPr>
-            <w:tcW w:w="3852" w:type="dxa"/>
+            <w:tcW w:w="4673" w:type="dxa"/>
             <w:tcMar>
               <w:top w:w="0" w:type="dxa"/>
               <w:left w:w="260" w:type="dxa"/>
@@ -216,14 +216,35 @@
                 <w:sz w:val="24"/>
                 <w:szCs w:val="24"/>
               </w:rPr>
-              <w:lastRenderedPageBreak/>
-              <w:t>{{#AccountCategoryL1}}Facility Category:</w:t>
+              <w:t>{{#AccountCategoryL1</w:t>
+            </w:r>
+            <w:proofErr w:type="gramStart"/>
+            <w:r>
+              <w:rPr>
+                <w:rFonts w:ascii="BC Sans" w:hAnsi="BC Sans"/>
+                <w:b/>
+                <w:bCs/>
+                <w:sz w:val="24"/>
+                <w:szCs w:val="24"/>
+              </w:rPr>
+              <w:t>}}Facility</w:t>
+            </w:r>
+            <w:proofErr w:type="gramEnd"/>
+            <w:r>
+              <w:rPr>
+                <w:rFonts w:ascii="BC Sans" w:hAnsi="BC Sans"/>
+                <w:b/>
+                <w:bCs/>
+                <w:sz w:val="24"/>
+                <w:szCs w:val="24"/>
+              </w:rPr>
+              <w:t xml:space="preserve"> Category:</w:t>
             </w:r>
           </w:p>
         </w:tc>
         <w:tc>
           <w:tcPr>
-            <w:tcW w:w="3852" w:type="dxa"/>
+            <w:tcW w:w="4673" w:type="dxa"/>
             <w:tcMar>
               <w:top w:w="0" w:type="dxa"/>
               <w:left w:w="260" w:type="dxa"/>
@@ -283,6 +304,7 @@
                 <w:sz w:val="24"/>
                 <w:szCs w:val="24"/>
               </w:rPr>
+              <w:lastRenderedPageBreak/>
               <w:t>{{AccountCategoryL3}}{{/AccountCategoryL3}}{{/AccountCategoryL1}}</w:t>
             </w:r>
           </w:p>
@@ -332,13 +354,37 @@
                 <w:szCs w:val="24"/>
               </w:rPr>
               <w:lastRenderedPageBreak/>
-              <w:t>{{#IF_showLicensePlate}}License Plate #:</w:t>
+              <w:t>{{#IF_showLicensePlate</w:t>
+            </w:r>
+            <w:proofErr w:type="gramStart"/>
+            <w:r>
+              <w:rPr>
+                <w:rFonts w:ascii="BC Sans" w:hAnsi="BC Sans"/>
+                <w:b/>
+                <w:bCs/>
+                <w:color w:val="000000"/>
+                <w:sz w:val="24"/>
+                <w:szCs w:val="24"/>
+              </w:rPr>
+              <w:t>}}License</w:t>
+            </w:r>
+            <w:proofErr w:type="gramEnd"/>
+            <w:r>
+              <w:rPr>
+                <w:rFonts w:ascii="BC Sans" w:hAnsi="BC Sans"/>
+                <w:b/>
+                <w:bCs/>
+                <w:color w:val="000000"/>
+                <w:sz w:val="24"/>
+                <w:szCs w:val="24"/>
+              </w:rPr>
+              <w:t xml:space="preserve"> Plate #:</w:t>
             </w:r>
           </w:p>
         </w:tc>
         <w:tc>
           <w:tcPr>
-            <w:tcW w:w="3852" w:type="dxa"/>
+            <w:tcW w:w="4673" w:type="dxa"/>
             <w:tcMar>
               <w:top w:w="0" w:type="dxa"/>
               <w:left w:w="260" w:type="dxa"/>
@@ -452,13 +498,35 @@
                 <w:sz w:val="24"/>
                 <w:szCs w:val="24"/>
               </w:rPr>
-              <w:t>{{#BLOrganizationName}}Owner:</w:t>
+              <w:t>{{#BLOrganizationName</w:t>
+            </w:r>
+            <w:proofErr w:type="gramStart"/>
+            <w:r>
+              <w:rPr>
+                <w:rFonts w:ascii="BC Sans" w:hAnsi="BC Sans"/>
+                <w:b/>
+                <w:bCs/>
+                <w:sz w:val="24"/>
+                <w:szCs w:val="24"/>
+              </w:rPr>
+              <w:t>}}Owner</w:t>
+            </w:r>
+            <w:proofErr w:type="gramEnd"/>
+            <w:r>
+              <w:rPr>
+                <w:rFonts w:ascii="BC Sans" w:hAnsi="BC Sans"/>
+                <w:b/>
+                <w:bCs/>
+                <w:sz w:val="24"/>
+                <w:szCs w:val="24"/>
+              </w:rPr>
+              <w:t>:</w:t>
             </w:r>
           </w:p>
         </w:tc>
         <w:tc>
           <w:tcPr>
-            <w:tcW w:w="3852" w:type="dxa"/>
+            <w:tcW w:w="4673" w:type="dxa"/>
             <w:tcMar>
               <w:top w:w="0" w:type="dxa"/>
               <w:left w:w="260" w:type="dxa"/>
@@ -540,7 +608,7 @@
     <w:tbl>
       <w:tblPr>
         <w:tblStyle w:val="TableGrid"/>
-        <w:tblW w:w="0" w:type="auto"/>
+        <w:tblW w:w="9493" w:type="dxa"/>
         <w:tblBorders>
           <w:top w:val="none" w:sz="0" w:space="0" w:color="auto"/>
           <w:left w:val="none" w:sz="0" w:space="0" w:color="auto"/>
@@ -552,7 +620,7 @@
         <w:tblLook w:val="04A0" w:firstRow="1" w:lastRow="0" w:firstColumn="1" w:lastColumn="0" w:noHBand="0" w:noVBand="1"/>
       </w:tblPr>
       <w:tblGrid>
-        <w:gridCol w:w="8414"/>
+        <w:gridCol w:w="9493"/>
       </w:tblGrid>
       <w:tr>
         <w:trPr>
@@ -560,7 +628,7 @@
         </w:trPr>
         <w:tc>
           <w:tcPr>
-            <w:tcW w:w="8414" w:type="dxa"/>
+            <w:tcW w:w="9493" w:type="dxa"/>
           </w:tcPr>
           <w:p>
             <w:pPr>
@@ -607,7 +675,7 @@
       <w:tr>
         <w:tc>
           <w:tcPr>
-            <w:tcW w:w="8414" w:type="dxa"/>
+            <w:tcW w:w="9493" w:type="dxa"/>
           </w:tcPr>
           <w:p>
             <w:pPr>
@@ -718,6 +786,7 @@
                 <w:ilvl w:val="0"/>
                 <w:numId w:val="19"/>
               </w:numPr>
+              <w:jc w:val="both"/>
               <w:rPr>
                 <w:rFonts w:ascii="BC Sans" w:hAnsi="BC Sans"/>
                 <w:sz w:val="24"/>
@@ -730,6 +799,7 @@
                 <w:sz w:val="24"/>
                 <w:szCs w:val="24"/>
               </w:rPr>
+              <w:lastRenderedPageBreak/>
               <w:t>{{Description}}</w:t>
             </w:r>
           </w:p>
@@ -1068,8 +1138,8 @@
             </w:tabs>
             <w:rPr>
               <w:kern w:val="2"/>
-              <w:sz w:val="16"/>
-              <w:szCs w:val="16"/>
+              <w:sz w:val="10"/>
+              <w:szCs w:val="10"/>
               <w:lang w:val="en-CA" w:eastAsia="en-CA"/>
               <w14:ligatures w14:val="standardContextual"/>
             </w:rPr>
@@ -1077,19 +1147,33 @@
           <w:r>
             <w:rPr>
               <w:kern w:val="2"/>
-              <w:sz w:val="16"/>
-              <w:szCs w:val="16"/>
+              <w:sz w:val="10"/>
+              <w:szCs w:val="10"/>
               <w:lang w:val="en-CA" w:eastAsia="en-CA"/>
               <w14:ligatures w14:val="standardContextual"/>
             </w:rPr>
             <w:t>{{#IF_HA_Northern}}</w:t>
           </w:r>
+        </w:p>
+        <w:p>
+          <w:pPr>
+            <w:tabs>
+              <w:tab w:val="left" w:pos="3912"/>
+            </w:tabs>
+            <w:rPr>
+              <w:kern w:val="2"/>
+              <w:sz w:val="10"/>
+              <w:szCs w:val="10"/>
+              <w:lang w:val="en-CA" w:eastAsia="en-CA"/>
+              <w14:ligatures w14:val="standardContextual"/>
+            </w:rPr>
+          </w:pPr>
           <w:r>
             <w:rPr>
               <w:noProof/>
               <w:kern w:val="2"/>
-              <w:sz w:val="16"/>
-              <w:szCs w:val="16"/>
+              <w:sz w:val="10"/>
+              <w:szCs w:val="10"/>
               <w:lang w:val="en-CA" w:eastAsia="en-CA"/>
             </w:rPr>
             <w:drawing>
@@ -1131,8 +1215,8 @@
           <w:r>
             <w:rPr>
               <w:kern w:val="2"/>
-              <w:sz w:val="16"/>
-              <w:szCs w:val="16"/>
+              <w:sz w:val="10"/>
+              <w:szCs w:val="10"/>
               <w:lang w:val="en-CA" w:eastAsia="en-CA"/>
               <w14:ligatures w14:val="standardContextual"/>
             </w:rPr>
@@ -1142,8 +1226,8 @@
           <w:r>
             <w:rPr>
               <w:kern w:val="2"/>
-              <w:sz w:val="16"/>
-              <w:szCs w:val="16"/>
+              <w:sz w:val="10"/>
+              <w:szCs w:val="10"/>
               <w:lang w:val="en-CA" w:eastAsia="en-CA"/>
               <w14:ligatures w14:val="standardContextual"/>
             </w:rPr>
@@ -1154,8 +1238,8 @@
           <w:r>
             <w:rPr>
               <w:kern w:val="2"/>
-              <w:sz w:val="16"/>
-              <w:szCs w:val="16"/>
+              <w:sz w:val="10"/>
+              <w:szCs w:val="10"/>
               <w:lang w:val="en-CA" w:eastAsia="en-CA"/>
               <w14:ligatures w14:val="standardContextual"/>
             </w:rPr>
@@ -1165,8 +1249,8 @@
           <w:r>
             <w:rPr>
               <w:kern w:val="2"/>
-              <w:sz w:val="16"/>
-              <w:szCs w:val="16"/>
+              <w:sz w:val="10"/>
+              <w:szCs w:val="10"/>
               <w:lang w:val="en-CA" w:eastAsia="en-CA"/>
               <w14:ligatures w14:val="standardContextual"/>
             </w:rPr>
@@ -1176,8 +1260,8 @@
             <w:rPr>
               <w:noProof/>
               <w:kern w:val="2"/>
-              <w:sz w:val="16"/>
-              <w:szCs w:val="16"/>
+              <w:sz w:val="10"/>
+              <w:szCs w:val="10"/>
               <w:lang w:val="en-CA" w:eastAsia="en-CA"/>
             </w:rPr>
             <w:drawing>
@@ -1219,8 +1303,8 @@
           <w:r>
             <w:rPr>
               <w:kern w:val="2"/>
-              <w:sz w:val="16"/>
-              <w:szCs w:val="16"/>
+              <w:sz w:val="10"/>
+              <w:szCs w:val="10"/>
               <w:lang w:val="en-CA" w:eastAsia="en-CA"/>
               <w14:ligatures w14:val="standardContextual"/>
             </w:rPr>
@@ -1230,8 +1314,8 @@
           <w:r>
             <w:rPr>
               <w:kern w:val="2"/>
-              <w:sz w:val="16"/>
-              <w:szCs w:val="16"/>
+              <w:sz w:val="10"/>
+              <w:szCs w:val="10"/>
               <w:lang w:val="en-CA" w:eastAsia="en-CA"/>
               <w14:ligatures w14:val="standardContextual"/>
             </w:rPr>
@@ -1242,8 +1326,8 @@
           <w:r>
             <w:rPr>
               <w:kern w:val="2"/>
-              <w:sz w:val="16"/>
-              <w:szCs w:val="16"/>
+              <w:sz w:val="10"/>
+              <w:szCs w:val="10"/>
               <w:lang w:val="en-CA" w:eastAsia="en-CA"/>
               <w14:ligatures w14:val="standardContextual"/>
             </w:rPr>
@@ -1253,8 +1337,8 @@
           <w:r>
             <w:rPr>
               <w:kern w:val="2"/>
-              <w:sz w:val="16"/>
-              <w:szCs w:val="16"/>
+              <w:sz w:val="10"/>
+              <w:szCs w:val="10"/>
               <w:lang w:val="en-CA" w:eastAsia="en-CA"/>
               <w14:ligatures w14:val="standardContextual"/>
             </w:rPr>
@@ -1263,8 +1347,8 @@
           <w:r>
             <w:rPr>
               <w:noProof/>
-              <w:sz w:val="16"/>
-              <w:szCs w:val="16"/>
+              <w:sz w:val="10"/>
+              <w:szCs w:val="10"/>
               <w:lang w:val="en-CA"/>
             </w:rPr>
             <w:drawing>
@@ -1306,8 +1390,8 @@
           <w:r>
             <w:rPr>
               <w:kern w:val="2"/>
-              <w:sz w:val="16"/>
-              <w:szCs w:val="16"/>
+              <w:sz w:val="10"/>
+              <w:szCs w:val="10"/>
               <w:lang w:val="en-CA" w:eastAsia="en-CA"/>
               <w14:ligatures w14:val="standardContextual"/>
             </w:rPr>
@@ -1317,8 +1401,8 @@
           <w:r>
             <w:rPr>
               <w:kern w:val="2"/>
-              <w:sz w:val="16"/>
-              <w:szCs w:val="16"/>
+              <w:sz w:val="10"/>
+              <w:szCs w:val="10"/>
               <w:lang w:val="en-CA" w:eastAsia="en-CA"/>
               <w14:ligatures w14:val="standardContextual"/>
             </w:rPr>
@@ -1329,8 +1413,8 @@
           <w:r>
             <w:rPr>
               <w:kern w:val="2"/>
-              <w:sz w:val="16"/>
-              <w:szCs w:val="16"/>
+              <w:sz w:val="10"/>
+              <w:szCs w:val="10"/>
               <w:lang w:val="en-CA" w:eastAsia="en-CA"/>
               <w14:ligatures w14:val="standardContextual"/>
             </w:rPr>
@@ -1340,8 +1424,8 @@
           <w:r>
             <w:rPr>
               <w:kern w:val="2"/>
-              <w:sz w:val="16"/>
-              <w:szCs w:val="16"/>
+              <w:sz w:val="10"/>
+              <w:szCs w:val="10"/>
               <w:lang w:val="en-CA" w:eastAsia="en-CA"/>
               <w14:ligatures w14:val="standardContextual"/>
             </w:rPr>
@@ -1351,8 +1435,8 @@
             <w:rPr>
               <w:noProof/>
               <w:kern w:val="2"/>
-              <w:sz w:val="16"/>
-              <w:szCs w:val="16"/>
+              <w:sz w:val="10"/>
+              <w:szCs w:val="10"/>
               <w:lang w:val="en-CA" w:eastAsia="en-CA"/>
             </w:rPr>
             <w:drawing>
@@ -1394,8 +1478,8 @@
           <w:r>
             <w:rPr>
               <w:kern w:val="2"/>
-              <w:sz w:val="16"/>
-              <w:szCs w:val="16"/>
+              <w:sz w:val="10"/>
+              <w:szCs w:val="10"/>
               <w:lang w:val="en-CA" w:eastAsia="en-CA"/>
               <w14:ligatures w14:val="standardContextual"/>
             </w:rPr>
@@ -1405,8 +1489,8 @@
           <w:r>
             <w:rPr>
               <w:kern w:val="2"/>
-              <w:sz w:val="16"/>
-              <w:szCs w:val="16"/>
+              <w:sz w:val="10"/>
+              <w:szCs w:val="10"/>
               <w:lang w:val="en-CA" w:eastAsia="en-CA"/>
               <w14:ligatures w14:val="standardContextual"/>
             </w:rPr>
@@ -1416,8 +1500,8 @@
           <w:r>
             <w:rPr>
               <w:kern w:val="2"/>
-              <w:sz w:val="16"/>
-              <w:szCs w:val="16"/>
+              <w:sz w:val="10"/>
+              <w:szCs w:val="10"/>
               <w:lang w:val="en-CA" w:eastAsia="en-CA"/>
               <w14:ligatures w14:val="standardContextual"/>
             </w:rPr>
@@ -1426,8 +1510,8 @@
           <w:r>
             <w:rPr>
               <w:kern w:val="2"/>
-              <w:sz w:val="16"/>
-              <w:szCs w:val="16"/>
+              <w:sz w:val="10"/>
+              <w:szCs w:val="10"/>
               <w:lang w:val="en-CA" w:eastAsia="en-CA"/>
               <w14:ligatures w14:val="standardContextual"/>
             </w:rPr>
@@ -1438,8 +1522,8 @@
             <w:rPr>
               <w:noProof/>
               <w:kern w:val="2"/>
-              <w:sz w:val="16"/>
-              <w:szCs w:val="16"/>
+              <w:sz w:val="10"/>
+              <w:szCs w:val="10"/>
               <w:lang w:val="en-CA" w:eastAsia="en-CA"/>
             </w:rPr>
             <w:drawing>
@@ -1481,8 +1565,8 @@
           <w:r>
             <w:rPr>
               <w:kern w:val="2"/>
-              <w:sz w:val="16"/>
-              <w:szCs w:val="16"/>
+              <w:sz w:val="10"/>
+              <w:szCs w:val="10"/>
               <w:lang w:val="en-CA" w:eastAsia="en-CA"/>
               <w14:ligatures w14:val="standardContextual"/>
             </w:rPr>
@@ -1492,8 +1576,8 @@
           <w:r>
             <w:rPr>
               <w:kern w:val="2"/>
-              <w:sz w:val="16"/>
-              <w:szCs w:val="16"/>
+              <w:sz w:val="10"/>
+              <w:szCs w:val="10"/>
               <w:lang w:val="en-CA" w:eastAsia="en-CA"/>
               <w14:ligatures w14:val="standardContextual"/>
             </w:rPr>
@@ -1503,8 +1587,8 @@
           <w:r>
             <w:rPr>
               <w:kern w:val="2"/>
-              <w:sz w:val="16"/>
-              <w:szCs w:val="16"/>
+              <w:sz w:val="10"/>
+              <w:szCs w:val="10"/>
               <w:lang w:val="en-CA" w:eastAsia="en-CA"/>
               <w14:ligatures w14:val="standardContextual"/>
             </w:rPr>
@@ -15162,17 +15246,6 @@
 </file>
 
 <file path=customXml/item1.xml><?xml version="1.0" encoding="utf-8"?>
-<p:properties xmlns:p="http://schemas.microsoft.com/office/2006/metadata/properties" xmlns:xsi="http://www.w3.org/2001/XMLSchema-instance" xmlns:pc="http://schemas.microsoft.com/office/infopath/2007/PartnerControls">
-  <documentManagement>
-    <lcf76f155ced4ddcb4097134ff3c332f xmlns="94d5cf59-5162-48bc-aa9b-620df72947f5">
-      <Terms xmlns="http://schemas.microsoft.com/office/infopath/2007/PartnerControls"/>
-    </lcf76f155ced4ddcb4097134ff3c332f>
-    <TaxCatchAll xmlns="8350b7c0-334b-4e19-bfc1-744f6a979eee" xsi:nil="true"/>
-  </documentManagement>
-</p:properties>
-</file>
-
-<file path=customXml/item2.xml><?xml version="1.0" encoding="utf-8"?>
 <?mso-contentType ?>
 <FormTemplates xmlns="http://schemas.microsoft.com/sharepoint/v3/contenttype/forms">
   <Display>DocumentLibraryForm</Display>
@@ -15181,7 +15254,7 @@
 </FormTemplates>
 </file>
 
-<file path=customXml/item3.xml><?xml version="1.0" encoding="utf-8"?>
+<file path=customXml/item2.xml><?xml version="1.0" encoding="utf-8"?>
 <ct:contentTypeSchema xmlns:ct="http://schemas.microsoft.com/office/2006/metadata/contentType" xmlns:ma="http://schemas.microsoft.com/office/2006/metadata/properties/metaAttributes" ct:_="" ma:_="" ma:contentTypeName="Document" ma:contentTypeID="0x01010015F16144C0593A4A82C8AE0B67DB460F" ma:contentTypeVersion="11" ma:contentTypeDescription="Create a new document." ma:contentTypeScope="" ma:versionID="f03428ffc1746d68619392bc270e65d0">
   <xsd:schema xmlns:xsd="http://www.w3.org/2001/XMLSchema" xmlns:xs="http://www.w3.org/2001/XMLSchema" xmlns:p="http://schemas.microsoft.com/office/2006/metadata/properties" xmlns:ns2="94d5cf59-5162-48bc-aa9b-620df72947f5" xmlns:ns3="8350b7c0-334b-4e19-bfc1-744f6a979eee" targetNamespace="http://schemas.microsoft.com/office/2006/metadata/properties" ma:root="true" ma:fieldsID="2206ae29c74f0be434f81d51f34f460d" ns2:_="" ns3:_="">
     <xsd:import namespace="94d5cf59-5162-48bc-aa9b-620df72947f5"/>
@@ -15376,18 +15449,18 @@
 </ct:contentTypeSchema>
 </file>
 
-<file path=customXml/itemProps1.xml><?xml version="1.0" encoding="utf-8"?>
-<ds:datastoreItem xmlns:ds="http://schemas.openxmlformats.org/officeDocument/2006/customXml" ds:itemID="{A7606A45-B25C-4FBA-BE17-306B7D23C091}">
-  <ds:schemaRefs>
-    <ds:schemaRef ds:uri="http://schemas.microsoft.com/office/2006/metadata/properties"/>
-    <ds:schemaRef ds:uri="http://schemas.microsoft.com/office/infopath/2007/PartnerControls"/>
-    <ds:schemaRef ds:uri="94d5cf59-5162-48bc-aa9b-620df72947f5"/>
-    <ds:schemaRef ds:uri="8350b7c0-334b-4e19-bfc1-744f6a979eee"/>
-  </ds:schemaRefs>
-</ds:datastoreItem>
+<file path=customXml/item3.xml><?xml version="1.0" encoding="utf-8"?>
+<p:properties xmlns:p="http://schemas.microsoft.com/office/2006/metadata/properties" xmlns:xsi="http://www.w3.org/2001/XMLSchema-instance" xmlns:pc="http://schemas.microsoft.com/office/infopath/2007/PartnerControls">
+  <documentManagement>
+    <lcf76f155ced4ddcb4097134ff3c332f xmlns="94d5cf59-5162-48bc-aa9b-620df72947f5">
+      <Terms xmlns="http://schemas.microsoft.com/office/infopath/2007/PartnerControls"/>
+    </lcf76f155ced4ddcb4097134ff3c332f>
+    <TaxCatchAll xmlns="8350b7c0-334b-4e19-bfc1-744f6a979eee" xsi:nil="true"/>
+  </documentManagement>
+</p:properties>
 </file>
 
-<file path=customXml/itemProps2.xml><?xml version="1.0" encoding="utf-8"?>
+<file path=customXml/itemProps1.xml><?xml version="1.0" encoding="utf-8"?>
 <ds:datastoreItem xmlns:ds="http://schemas.openxmlformats.org/officeDocument/2006/customXml" ds:itemID="{360ECE8A-3139-463D-90B6-2A7471686095}">
   <ds:schemaRefs>
     <ds:schemaRef ds:uri="http://schemas.microsoft.com/sharepoint/v3/contenttype/forms"/>
@@ -15395,7 +15468,7 @@
 </ds:datastoreItem>
 </file>
 
-<file path=customXml/itemProps3.xml><?xml version="1.0" encoding="utf-8"?>
+<file path=customXml/itemProps2.xml><?xml version="1.0" encoding="utf-8"?>
 <ds:datastoreItem xmlns:ds="http://schemas.openxmlformats.org/officeDocument/2006/customXml" ds:itemID="{5B64FE0E-7912-4F95-AAFF-E0C8FB9265FD}">
   <ds:schemaRefs>
     <ds:schemaRef ds:uri="http://schemas.microsoft.com/office/2006/metadata/contentType"/>
@@ -15414,6 +15487,17 @@
 </ds:datastoreItem>
 </file>
 
+<file path=customXml/itemProps3.xml><?xml version="1.0" encoding="utf-8"?>
+<ds:datastoreItem xmlns:ds="http://schemas.openxmlformats.org/officeDocument/2006/customXml" ds:itemID="{A7606A45-B25C-4FBA-BE17-306B7D23C091}">
+  <ds:schemaRefs>
+    <ds:schemaRef ds:uri="http://schemas.microsoft.com/office/2006/metadata/properties"/>
+    <ds:schemaRef ds:uri="http://schemas.microsoft.com/office/infopath/2007/PartnerControls"/>
+    <ds:schemaRef ds:uri="94d5cf59-5162-48bc-aa9b-620df72947f5"/>
+    <ds:schemaRef ds:uri="8350b7c0-334b-4e19-bfc1-744f6a979eee"/>
+  </ds:schemaRefs>
+</ds:datastoreItem>
+</file>
+
 <file path=docMetadata/LabelInfo.xml><?xml version="1.0" encoding="utf-8"?>
 <clbl:labelList xmlns:clbl="http://schemas.microsoft.com/office/2020/mipLabelMetadata">
   <clbl:label id="{ccb6fc37-a1d1-4252-981c-63836d1ca50c}" enabled="1" method="Standard" siteId="{e0793d39-0939-496d-b129-198edd916feb}" removed="0"/>

</xml_diff>